<commit_message>
docs: sync backlog and external integrations roadmap
</commit_message>
<xml_diff>
--- a/Fase 2/Evidencias Proyecto/Evidencias de documentación/Scrum/09_Epicas_Historias_Usuario_CitaJusta.docx
+++ b/Fase 2/Evidencias Proyecto/Evidencias de documentación/Scrum/09_Epicas_Historias_Usuario_CitaJusta.docx
@@ -313,6 +313,7 @@
       <w:tr>
         <w:trPr>
           <w:cantSplit/>
+          <w:tblHeader w:val="true"/>
         </w:trPr>
         <w:tc>
           <w:tcPr>
@@ -381,15 +382,8 @@
           </w:tcPr>
           <w:p>
             <w:r>
-              <w:t>1.4 — actualización de Sprint 7</w:t>
-            </w:r>
-            <w:proofErr w:type="spellStart"/>
-            <w:r/>
-            <w:proofErr w:type="spellEnd"/>
-            <w:r/>
-            <w:proofErr w:type="spellStart"/>
-            <w:r/>
-            <w:proofErr w:type="spellEnd"/>
+              <w:t>1.5 — actualización de cierre Sprint 7 y planificación Sprint 8</w:t>
+            </w:r>
           </w:p>
         </w:tc>
       </w:tr>
@@ -424,7 +418,7 @@
           </w:tcPr>
           <w:p>
             <w:r>
-              <w:t>23-09-2026</w:t>
+              <w:t>04-10-2026</w:t>
             </w:r>
           </w:p>
         </w:tc>
@@ -457,23 +451,9 @@
             <w:vAlign w:val="center"/>
           </w:tcPr>
           <w:p>
-            <w:proofErr w:type="spellStart"/>
-            <w:r>
-              <w:t>Documento actualizado con HU-021 a HU-029 completadas; MVP Web cerrado y Desktop/Tauri en progreso</w:t>
-            </w:r>
-            <w:proofErr w:type="spellEnd"/>
-            <w:r/>
-            <w:proofErr w:type="spellStart"/>
-            <w:r/>
-            <w:proofErr w:type="spellEnd"/>
-            <w:r/>
-            <w:proofErr w:type="spellStart"/>
-            <w:r/>
-            <w:proofErr w:type="spellEnd"/>
-            <w:r/>
-            <w:proofErr w:type="spellStart"/>
-            <w:r/>
-            <w:proofErr w:type="spellEnd"/>
+            <w:r>
+              <w:t>Documento actualizado con HU-021 a HU-043; Sprint 7 cerrado y Sprint 8 de integraciones externas planificado</w:t>
+            </w:r>
           </w:p>
         </w:tc>
       </w:tr>
@@ -770,7 +750,7 @@
                 <w:bCs/>
                 <w:color w:val="000000"/>
               </w:rPr>
-              <w:t>5. Observaciones para la primera evaluación</w:t>
+              <w:t>5. Observaciones de actualización al 04-10-2026</w:t>
             </w:r>
             <w:r>
               <w:rPr>
@@ -892,6 +872,7 @@
         <w:trPr>
           <w:jc w:val="center"/>
           <w:cantSplit/>
+          <w:tblHeader w:val="true"/>
         </w:trPr>
         <w:tc>
           <w:tcPr>
@@ -1471,7 +1452,7 @@
           </w:tcPr>
           <w:p>
             <w:r>
-              <w:t>HU-009, HU-010, HU-011, HU-022, HU-023</w:t>
+              <w:t>HU-009, HU-010, HU-011, HU-022, HU-023, HU-035</w:t>
             </w:r>
           </w:p>
         </w:tc>
@@ -1798,7 +1779,7 @@
           </w:tcPr>
           <w:p>
             <w:r>
-              <w:t>HU-027, HU-028, HU-029</w:t>
+              <w:t>HU-027, HU-028, HU-029, HU-030, HU-031, HU-032, HU-033, HU-034, HU-036, HU-037, HU-038</w:t>
             </w:r>
           </w:p>
         </w:tc>
@@ -1811,6 +1792,75 @@
           <w:p>
             <w:r>
               <w:t>Must</w:t>
+            </w:r>
+          </w:p>
+        </w:tc>
+      </w:tr>
+      <w:tr>
+        <w:trPr>
+          <w:cantSplit/>
+        </w:trPr>
+        <w:tc>
+          <w:tcPr>
+            <w:tcW w:type="dxa" w:w="2556"/>
+            <w:vAlign w:val="center"/>
+          </w:tcPr>
+          <w:p>
+            <w:r/>
+            <w:r>
+              <w:rPr>
+                <w:b w:val="0"/>
+                <w:sz w:val="18"/>
+              </w:rPr>
+              <w:t>EP-13</w:t>
+            </w:r>
+          </w:p>
+        </w:tc>
+        <w:tc>
+          <w:tcPr>
+            <w:tcW w:type="dxa" w:w="2556"/>
+            <w:vAlign w:val="center"/>
+          </w:tcPr>
+          <w:p>
+            <w:r/>
+            <w:r>
+              <w:rPr>
+                <w:b w:val="0"/>
+                <w:sz w:val="18"/>
+              </w:rPr>
+              <w:t>Integraciones externas</w:t>
+            </w:r>
+          </w:p>
+        </w:tc>
+        <w:tc>
+          <w:tcPr>
+            <w:tcW w:type="dxa" w:w="2556"/>
+            <w:vAlign w:val="center"/>
+          </w:tcPr>
+          <w:p>
+            <w:r/>
+            <w:r>
+              <w:rPr>
+                <w:b w:val="0"/>
+                <w:sz w:val="18"/>
+              </w:rPr>
+              <w:t>HU-039, HU-040, HU-041, HU-042, HU-043</w:t>
+            </w:r>
+          </w:p>
+        </w:tc>
+        <w:tc>
+          <w:tcPr>
+            <w:tcW w:type="dxa" w:w="2556"/>
+            <w:vAlign w:val="center"/>
+          </w:tcPr>
+          <w:p>
+            <w:r/>
+            <w:r>
+              <w:rPr>
+                <w:b w:val="0"/>
+                <w:sz w:val="18"/>
+              </w:rPr>
+              <w:t>Should</w:t>
             </w:r>
           </w:p>
         </w:tc>
@@ -1841,248 +1891,128 @@
     </w:p>
     <w:p>
       <w:r>
-        <w:t xml:space="preserve">Se </w:t>
+        <w:t>Se utiliza una priorización tipo MoSCoW como apoyo visual. Las épicas que sostienen el MVP (acceso, citas, agenda, administración, lista de espera, ofertas, reasignación y notificaciones) se consideran Must. Desktop institucional también se mantiene como Must para la operación institucional del producto objetivo. Operación, auditoría e integraciones externas se consideran Should, mientras que reportes se mantiene como Could.</w:t>
       </w:r>
       <w:proofErr w:type="spellStart"/>
-      <w:r>
-        <w:t>utiliza</w:t>
-      </w:r>
+      <w:r/>
       <w:proofErr w:type="spellEnd"/>
-      <w:r>
-        <w:t xml:space="preserve"> </w:t>
-      </w:r>
+      <w:r/>
       <w:proofErr w:type="spellStart"/>
-      <w:r>
-        <w:t>una</w:t>
-      </w:r>
+      <w:r/>
       <w:proofErr w:type="spellEnd"/>
-      <w:r>
-        <w:t xml:space="preserve"> </w:t>
-      </w:r>
+      <w:r/>
       <w:proofErr w:type="spellStart"/>
-      <w:r>
-        <w:t>priorización</w:t>
-      </w:r>
+      <w:r/>
       <w:proofErr w:type="spellEnd"/>
-      <w:r>
-        <w:t xml:space="preserve"> </w:t>
-      </w:r>
+      <w:r/>
       <w:proofErr w:type="spellStart"/>
-      <w:r>
-        <w:t>tipo</w:t>
-      </w:r>
+      <w:r/>
       <w:proofErr w:type="spellEnd"/>
-      <w:r>
-        <w:t xml:space="preserve"> </w:t>
-      </w:r>
+      <w:r/>
       <w:proofErr w:type="spellStart"/>
-      <w:r>
-        <w:t>MoSCoW</w:t>
-      </w:r>
+      <w:r/>
       <w:proofErr w:type="spellEnd"/>
-      <w:r>
-        <w:t xml:space="preserve"> </w:t>
-      </w:r>
+      <w:r/>
       <w:proofErr w:type="spellStart"/>
-      <w:r>
-        <w:t>como</w:t>
-      </w:r>
+      <w:r/>
       <w:proofErr w:type="spellEnd"/>
-      <w:r>
-        <w:t xml:space="preserve"> </w:t>
-      </w:r>
+      <w:r/>
       <w:proofErr w:type="spellStart"/>
-      <w:r>
-        <w:t>apoyo</w:t>
-      </w:r>
+      <w:r/>
       <w:proofErr w:type="spellEnd"/>
-      <w:r>
-        <w:t xml:space="preserve"> visual. Las </w:t>
-      </w:r>
+      <w:r/>
       <w:proofErr w:type="spellStart"/>
-      <w:r>
-        <w:t>épicas</w:t>
-      </w:r>
+      <w:r/>
       <w:proofErr w:type="spellEnd"/>
-      <w:r>
-        <w:t xml:space="preserve"> </w:t>
-      </w:r>
+      <w:r/>
       <w:proofErr w:type="spellStart"/>
-      <w:r>
-        <w:t>que</w:t>
-      </w:r>
+      <w:r/>
       <w:proofErr w:type="spellEnd"/>
-      <w:r>
-        <w:t xml:space="preserve"> </w:t>
-      </w:r>
+      <w:r/>
       <w:proofErr w:type="spellStart"/>
-      <w:r>
-        <w:t>sostienen</w:t>
-      </w:r>
+      <w:r/>
       <w:proofErr w:type="spellEnd"/>
-      <w:r>
-        <w:t xml:space="preserve"> </w:t>
-      </w:r>
+      <w:r/>
       <w:proofErr w:type="spellStart"/>
-      <w:r>
-        <w:t>el</w:t>
-      </w:r>
+      <w:r/>
       <w:proofErr w:type="spellEnd"/>
-      <w:r>
-        <w:t xml:space="preserve"> MVP (</w:t>
-      </w:r>
+      <w:r/>
       <w:proofErr w:type="spellStart"/>
-      <w:r>
-        <w:t>acceso</w:t>
-      </w:r>
+      <w:r/>
       <w:proofErr w:type="spellEnd"/>
-      <w:r>
-        <w:t xml:space="preserve">, </w:t>
-      </w:r>
+      <w:r/>
       <w:proofErr w:type="spellStart"/>
-      <w:r>
-        <w:t>citas</w:t>
-      </w:r>
+      <w:r/>
       <w:proofErr w:type="spellEnd"/>
-      <w:r>
-        <w:t xml:space="preserve">, agenda, </w:t>
-      </w:r>
+      <w:r/>
       <w:proofErr w:type="spellStart"/>
-      <w:r>
-        <w:t>administración</w:t>
-      </w:r>
+      <w:r/>
       <w:proofErr w:type="spellEnd"/>
-      <w:r>
-        <w:t xml:space="preserve">, </w:t>
-      </w:r>
+      <w:r/>
       <w:proofErr w:type="spellStart"/>
-      <w:r>
-        <w:t>lista</w:t>
-      </w:r>
+      <w:r/>
       <w:proofErr w:type="spellEnd"/>
-      <w:r>
-        <w:t xml:space="preserve"> de </w:t>
-      </w:r>
+      <w:r/>
       <w:proofErr w:type="spellStart"/>
-      <w:r>
-        <w:t>espera</w:t>
-      </w:r>
+      <w:r/>
       <w:proofErr w:type="spellEnd"/>
-      <w:r>
-        <w:t xml:space="preserve">, </w:t>
-      </w:r>
+      <w:r/>
       <w:proofErr w:type="spellStart"/>
-      <w:r>
-        <w:t>ofertas</w:t>
-      </w:r>
+      <w:r/>
       <w:proofErr w:type="spellEnd"/>
-      <w:r>
-        <w:t xml:space="preserve">, </w:t>
-      </w:r>
+      <w:r/>
       <w:proofErr w:type="spellStart"/>
-      <w:r>
-        <w:t>reasignación</w:t>
-      </w:r>
+      <w:r/>
       <w:proofErr w:type="spellEnd"/>
-      <w:r>
-        <w:t xml:space="preserve"> y </w:t>
-      </w:r>
+      <w:r/>
       <w:proofErr w:type="spellStart"/>
-      <w:r>
-        <w:t>notificaciones</w:t>
-      </w:r>
+      <w:r/>
       <w:proofErr w:type="spellEnd"/>
-      <w:r>
-        <w:t xml:space="preserve">) se </w:t>
-      </w:r>
+      <w:r/>
       <w:proofErr w:type="spellStart"/>
-      <w:r>
-        <w:t>consideran</w:t>
-      </w:r>
+      <w:r/>
       <w:proofErr w:type="spellEnd"/>
-      <w:r>
-        <w:t xml:space="preserve"> Must. </w:t>
-      </w:r>
+      <w:r/>
       <w:proofErr w:type="spellStart"/>
-      <w:r>
-        <w:t>Operación</w:t>
-      </w:r>
+      <w:r/>
       <w:proofErr w:type="spellEnd"/>
-      <w:r>
-        <w:t xml:space="preserve"> y </w:t>
-      </w:r>
+      <w:r/>
       <w:proofErr w:type="spellStart"/>
-      <w:r>
-        <w:t>auditoría</w:t>
-      </w:r>
+      <w:r/>
       <w:proofErr w:type="spellEnd"/>
-      <w:r>
-        <w:t xml:space="preserve"> se </w:t>
-      </w:r>
+      <w:r/>
       <w:proofErr w:type="spellStart"/>
-      <w:r>
-        <w:t>consideran</w:t>
-      </w:r>
+      <w:r/>
       <w:proofErr w:type="spellEnd"/>
-      <w:r>
-        <w:t xml:space="preserve"> Should, </w:t>
-      </w:r>
+      <w:r/>
       <w:proofErr w:type="spellStart"/>
-      <w:r>
-        <w:t>mientras</w:t>
-      </w:r>
+      <w:r/>
       <w:proofErr w:type="spellEnd"/>
-      <w:r>
-        <w:t xml:space="preserve"> </w:t>
-      </w:r>
+      <w:r/>
       <w:proofErr w:type="spellStart"/>
-      <w:r>
-        <w:t>que</w:t>
-      </w:r>
+      <w:r/>
       <w:proofErr w:type="spellEnd"/>
-      <w:r>
-        <w:t xml:space="preserve"> </w:t>
-      </w:r>
+      <w:r/>
       <w:proofErr w:type="spellStart"/>
-      <w:r>
-        <w:t>reportes</w:t>
-      </w:r>
+      <w:r/>
       <w:proofErr w:type="spellEnd"/>
-      <w:r>
-        <w:t xml:space="preserve"> se </w:t>
-      </w:r>
+      <w:r/>
       <w:proofErr w:type="spellStart"/>
-      <w:r>
-        <w:t>mantiene</w:t>
-      </w:r>
+      <w:r/>
       <w:proofErr w:type="spellEnd"/>
-      <w:r>
-        <w:t xml:space="preserve"> </w:t>
-      </w:r>
+      <w:r/>
       <w:proofErr w:type="spellStart"/>
-      <w:r>
-        <w:t>como</w:t>
-      </w:r>
+      <w:r/>
       <w:proofErr w:type="spellEnd"/>
-      <w:r>
-        <w:t xml:space="preserve"> Could para la </w:t>
-      </w:r>
+      <w:r/>
       <w:proofErr w:type="spellStart"/>
-      <w:r>
-        <w:t>versión</w:t>
-      </w:r>
+      <w:r/>
       <w:proofErr w:type="spellEnd"/>
-      <w:r>
-        <w:t xml:space="preserve"> </w:t>
-      </w:r>
+      <w:r/>
       <w:proofErr w:type="spellStart"/>
-      <w:r>
-        <w:t>objetivo</w:t>
-      </w:r>
+      <w:r/>
       <w:proofErr w:type="spellEnd"/>
-      <w:r>
-        <w:t>.</w:t>
-      </w:r>
+      <w:r/>
     </w:p>
     <w:p/>
     <w:p>
@@ -2110,7 +2040,7 @@
     </w:p>
     <w:p>
       <w:r>
-        <w:t>El siguiente resumen consolida las historias definidas en CitaJusta e incorpora HU-021 a HU-029. Los Story Points de estas historias adicionales quedan pendientes de refinamiento por el Scrum Team; el detalle de criterios de aceptación debe mantenerse sincronizado con Product Backlog, Kanban e Issues de GitHub.</w:t>
+        <w:t>El siguiente resumen consolida las historias definidas en CitaJusta e incorpora HU-021 a HU-043. Los Story Points de HU-021 a HU-043 permanecen pendientes de refinamiento formal por el Scrum Team; el detalle de criterios de aceptación debe mantenerse sincronizado con Product Backlog, Kanban e Issues de GitHub.</w:t>
       </w:r>
       <w:proofErr w:type="spellStart"/>
       <w:r/>
@@ -2233,6 +2163,7 @@
         <w:trPr>
           <w:jc w:val="center"/>
           <w:cantSplit/>
+          <w:tblHeader w:val="true"/>
         </w:trPr>
         <w:tc>
           <w:tcPr>
@@ -10141,6 +10072,1420 @@
           </w:tcPr>
           <w:p>
             <w:r>
+              <w:t>Objetivo</w:t>
+            </w:r>
+          </w:p>
+        </w:tc>
+      </w:tr>
+      <w:tr>
+        <w:trPr>
+          <w:cantSplit/>
+        </w:trPr>
+        <w:tc>
+          <w:tcPr>
+            <w:tcW w:type="dxa" w:w="2145"/>
+            <w:vAlign w:val="center"/>
+          </w:tcPr>
+          <w:p>
+            <w:r/>
+            <w:r>
+              <w:rPr>
+                <w:b w:val="0"/>
+                <w:sz w:val="18"/>
+              </w:rPr>
+              <w:t>HU-030</w:t>
+            </w:r>
+          </w:p>
+        </w:tc>
+        <w:tc>
+          <w:tcPr>
+            <w:tcW w:type="dxa" w:w="1425"/>
+            <w:vAlign w:val="center"/>
+          </w:tcPr>
+          <w:p>
+            <w:r/>
+            <w:r>
+              <w:rPr>
+                <w:b w:val="0"/>
+                <w:sz w:val="18"/>
+              </w:rPr>
+              <w:t>Desktop institucional</w:t>
+            </w:r>
+          </w:p>
+        </w:tc>
+        <w:tc>
+          <w:tcPr>
+            <w:tcW w:type="dxa" w:w="2460"/>
+            <w:vAlign w:val="center"/>
+          </w:tcPr>
+          <w:p>
+            <w:r/>
+            <w:r>
+              <w:rPr>
+                <w:b w:val="0"/>
+                <w:sz w:val="18"/>
+              </w:rPr>
+              <w:t>Como administrador institucional autorizado, quiero gestionar profesionales desde CitaJusta Desktop, para mantener perfiles y asociaciones de atención desde la aplicación institucional.</w:t>
+            </w:r>
+          </w:p>
+        </w:tc>
+        <w:tc>
+          <w:tcPr>
+            <w:tcW w:type="dxa" w:w="1245"/>
+            <w:vAlign w:val="center"/>
+          </w:tcPr>
+          <w:p>
+            <w:r/>
+            <w:r>
+              <w:rPr>
+                <w:b w:val="0"/>
+                <w:sz w:val="18"/>
+              </w:rPr>
+              <w:t>Alta</w:t>
+            </w:r>
+          </w:p>
+        </w:tc>
+        <w:tc>
+          <w:tcPr>
+            <w:tcW w:type="dxa" w:w="1710"/>
+            <w:vAlign w:val="center"/>
+          </w:tcPr>
+          <w:p>
+            <w:r/>
+            <w:r>
+              <w:rPr>
+                <w:b w:val="0"/>
+                <w:sz w:val="18"/>
+              </w:rPr>
+              <w:t>Por estimar</w:t>
+            </w:r>
+          </w:p>
+        </w:tc>
+        <w:tc>
+          <w:tcPr>
+            <w:tcW w:type="dxa" w:w="1710"/>
+            <w:vAlign w:val="center"/>
+          </w:tcPr>
+          <w:p>
+            <w:r/>
+            <w:r>
+              <w:rPr>
+                <w:b w:val="0"/>
+                <w:sz w:val="18"/>
+              </w:rPr>
+              <w:t>Objetivo</w:t>
+            </w:r>
+          </w:p>
+        </w:tc>
+      </w:tr>
+      <w:tr>
+        <w:trPr>
+          <w:cantSplit/>
+        </w:trPr>
+        <w:tc>
+          <w:tcPr>
+            <w:tcW w:type="dxa" w:w="2145"/>
+            <w:vAlign w:val="center"/>
+          </w:tcPr>
+          <w:p>
+            <w:r/>
+            <w:r>
+              <w:rPr>
+                <w:b w:val="0"/>
+                <w:sz w:val="18"/>
+              </w:rPr>
+              <w:t>HU-031</w:t>
+            </w:r>
+          </w:p>
+        </w:tc>
+        <w:tc>
+          <w:tcPr>
+            <w:tcW w:type="dxa" w:w="1425"/>
+            <w:vAlign w:val="center"/>
+          </w:tcPr>
+          <w:p>
+            <w:r/>
+            <w:r>
+              <w:rPr>
+                <w:b w:val="0"/>
+                <w:sz w:val="18"/>
+              </w:rPr>
+              <w:t>Desktop institucional</w:t>
+            </w:r>
+          </w:p>
+        </w:tc>
+        <w:tc>
+          <w:tcPr>
+            <w:tcW w:type="dxa" w:w="2460"/>
+            <w:vAlign w:val="center"/>
+          </w:tcPr>
+          <w:p>
+            <w:r/>
+            <w:r>
+              <w:rPr>
+                <w:b w:val="0"/>
+                <w:sz w:val="18"/>
+              </w:rPr>
+              <w:t>Como funcionario institucional autorizado, quiero consultar la agenda diaria desde CitaJusta Desktop, para gestionar la operación con filtros y contexto real.</w:t>
+            </w:r>
+          </w:p>
+        </w:tc>
+        <w:tc>
+          <w:tcPr>
+            <w:tcW w:type="dxa" w:w="1245"/>
+            <w:vAlign w:val="center"/>
+          </w:tcPr>
+          <w:p>
+            <w:r/>
+            <w:r>
+              <w:rPr>
+                <w:b w:val="0"/>
+                <w:sz w:val="18"/>
+              </w:rPr>
+              <w:t>Alta</w:t>
+            </w:r>
+          </w:p>
+        </w:tc>
+        <w:tc>
+          <w:tcPr>
+            <w:tcW w:type="dxa" w:w="1710"/>
+            <w:vAlign w:val="center"/>
+          </w:tcPr>
+          <w:p>
+            <w:r/>
+            <w:r>
+              <w:rPr>
+                <w:b w:val="0"/>
+                <w:sz w:val="18"/>
+              </w:rPr>
+              <w:t>Por estimar</w:t>
+            </w:r>
+          </w:p>
+        </w:tc>
+        <w:tc>
+          <w:tcPr>
+            <w:tcW w:type="dxa" w:w="1710"/>
+            <w:vAlign w:val="center"/>
+          </w:tcPr>
+          <w:p>
+            <w:r/>
+            <w:r>
+              <w:rPr>
+                <w:b w:val="0"/>
+                <w:sz w:val="18"/>
+              </w:rPr>
+              <w:t>Objetivo</w:t>
+            </w:r>
+          </w:p>
+        </w:tc>
+      </w:tr>
+      <w:tr>
+        <w:trPr>
+          <w:cantSplit/>
+        </w:trPr>
+        <w:tc>
+          <w:tcPr>
+            <w:tcW w:type="dxa" w:w="2145"/>
+            <w:vAlign w:val="center"/>
+          </w:tcPr>
+          <w:p>
+            <w:r/>
+            <w:r>
+              <w:rPr>
+                <w:b w:val="0"/>
+                <w:sz w:val="18"/>
+              </w:rPr>
+              <w:t>HU-032</w:t>
+            </w:r>
+          </w:p>
+        </w:tc>
+        <w:tc>
+          <w:tcPr>
+            <w:tcW w:type="dxa" w:w="1425"/>
+            <w:vAlign w:val="center"/>
+          </w:tcPr>
+          <w:p>
+            <w:r/>
+            <w:r>
+              <w:rPr>
+                <w:b w:val="0"/>
+                <w:sz w:val="18"/>
+              </w:rPr>
+              <w:t>Desktop institucional</w:t>
+            </w:r>
+          </w:p>
+        </w:tc>
+        <w:tc>
+          <w:tcPr>
+            <w:tcW w:type="dxa" w:w="2460"/>
+            <w:vAlign w:val="center"/>
+          </w:tcPr>
+          <w:p>
+            <w:r/>
+            <w:r>
+              <w:rPr>
+                <w:b w:val="0"/>
+                <w:sz w:val="18"/>
+              </w:rPr>
+              <w:t>Como usuario institucional autorizado, quiero consultar y gestionar disponibilidad y bloqueos desde CitaJusta Desktop, para mantener horarios atendibles sin duplicar reglas del backend.</w:t>
+            </w:r>
+          </w:p>
+        </w:tc>
+        <w:tc>
+          <w:tcPr>
+            <w:tcW w:type="dxa" w:w="1245"/>
+            <w:vAlign w:val="center"/>
+          </w:tcPr>
+          <w:p>
+            <w:r/>
+            <w:r>
+              <w:rPr>
+                <w:b w:val="0"/>
+                <w:sz w:val="18"/>
+              </w:rPr>
+              <w:t>Alta</w:t>
+            </w:r>
+          </w:p>
+        </w:tc>
+        <w:tc>
+          <w:tcPr>
+            <w:tcW w:type="dxa" w:w="1710"/>
+            <w:vAlign w:val="center"/>
+          </w:tcPr>
+          <w:p>
+            <w:r/>
+            <w:r>
+              <w:rPr>
+                <w:b w:val="0"/>
+                <w:sz w:val="18"/>
+              </w:rPr>
+              <w:t>Por estimar</w:t>
+            </w:r>
+          </w:p>
+        </w:tc>
+        <w:tc>
+          <w:tcPr>
+            <w:tcW w:type="dxa" w:w="1710"/>
+            <w:vAlign w:val="center"/>
+          </w:tcPr>
+          <w:p>
+            <w:r/>
+            <w:r>
+              <w:rPr>
+                <w:b w:val="0"/>
+                <w:sz w:val="18"/>
+              </w:rPr>
+              <w:t>Objetivo</w:t>
+            </w:r>
+          </w:p>
+        </w:tc>
+      </w:tr>
+      <w:tr>
+        <w:trPr>
+          <w:cantSplit/>
+        </w:trPr>
+        <w:tc>
+          <w:tcPr>
+            <w:tcW w:type="dxa" w:w="2145"/>
+            <w:vAlign w:val="center"/>
+          </w:tcPr>
+          <w:p>
+            <w:r/>
+            <w:r>
+              <w:rPr>
+                <w:b w:val="0"/>
+                <w:sz w:val="18"/>
+              </w:rPr>
+              <w:t>HU-033</w:t>
+            </w:r>
+          </w:p>
+        </w:tc>
+        <w:tc>
+          <w:tcPr>
+            <w:tcW w:type="dxa" w:w="1425"/>
+            <w:vAlign w:val="center"/>
+          </w:tcPr>
+          <w:p>
+            <w:r/>
+            <w:r>
+              <w:rPr>
+                <w:b w:val="0"/>
+                <w:sz w:val="18"/>
+              </w:rPr>
+              <w:t>Desktop institucional</w:t>
+            </w:r>
+          </w:p>
+        </w:tc>
+        <w:tc>
+          <w:tcPr>
+            <w:tcW w:type="dxa" w:w="2460"/>
+            <w:vAlign w:val="center"/>
+          </w:tcPr>
+          <w:p>
+            <w:r/>
+            <w:r>
+              <w:rPr>
+                <w:b w:val="0"/>
+                <w:sz w:val="18"/>
+              </w:rPr>
+              <w:t>Como funcionario o profesional autorizado, quiero registrar asistencia o inasistencia desde CitaJusta Desktop, para mantener actualizado el resultado operativo de las citas.</w:t>
+            </w:r>
+          </w:p>
+        </w:tc>
+        <w:tc>
+          <w:tcPr>
+            <w:tcW w:type="dxa" w:w="1245"/>
+            <w:vAlign w:val="center"/>
+          </w:tcPr>
+          <w:p>
+            <w:r/>
+            <w:r>
+              <w:rPr>
+                <w:b w:val="0"/>
+                <w:sz w:val="18"/>
+              </w:rPr>
+              <w:t>Alta</w:t>
+            </w:r>
+          </w:p>
+        </w:tc>
+        <w:tc>
+          <w:tcPr>
+            <w:tcW w:type="dxa" w:w="1710"/>
+            <w:vAlign w:val="center"/>
+          </w:tcPr>
+          <w:p>
+            <w:r/>
+            <w:r>
+              <w:rPr>
+                <w:b w:val="0"/>
+                <w:sz w:val="18"/>
+              </w:rPr>
+              <w:t>Por estimar</w:t>
+            </w:r>
+          </w:p>
+        </w:tc>
+        <w:tc>
+          <w:tcPr>
+            <w:tcW w:type="dxa" w:w="1710"/>
+            <w:vAlign w:val="center"/>
+          </w:tcPr>
+          <w:p>
+            <w:r/>
+            <w:r>
+              <w:rPr>
+                <w:b w:val="0"/>
+                <w:sz w:val="18"/>
+              </w:rPr>
+              <w:t>Objetivo</w:t>
+            </w:r>
+          </w:p>
+        </w:tc>
+      </w:tr>
+      <w:tr>
+        <w:trPr>
+          <w:cantSplit/>
+        </w:trPr>
+        <w:tc>
+          <w:tcPr>
+            <w:tcW w:type="dxa" w:w="2145"/>
+            <w:vAlign w:val="center"/>
+          </w:tcPr>
+          <w:p>
+            <w:r/>
+            <w:r>
+              <w:rPr>
+                <w:b w:val="0"/>
+                <w:sz w:val="18"/>
+              </w:rPr>
+              <w:t>HU-034</w:t>
+            </w:r>
+          </w:p>
+        </w:tc>
+        <w:tc>
+          <w:tcPr>
+            <w:tcW w:type="dxa" w:w="1425"/>
+            <w:vAlign w:val="center"/>
+          </w:tcPr>
+          <w:p>
+            <w:r/>
+            <w:r>
+              <w:rPr>
+                <w:b w:val="0"/>
+                <w:sz w:val="18"/>
+              </w:rPr>
+              <w:t>Desktop institucional</w:t>
+            </w:r>
+          </w:p>
+        </w:tc>
+        <w:tc>
+          <w:tcPr>
+            <w:tcW w:type="dxa" w:w="2460"/>
+            <w:vAlign w:val="center"/>
+          </w:tcPr>
+          <w:p>
+            <w:r/>
+            <w:r>
+              <w:rPr>
+                <w:b w:val="0"/>
+                <w:sz w:val="18"/>
+              </w:rPr>
+              <w:t>Como usuario institucional, quiero una interfaz Desktop visualmente consistente y accesible, para operar los módulos reales con navegación y estados claros.</w:t>
+            </w:r>
+          </w:p>
+        </w:tc>
+        <w:tc>
+          <w:tcPr>
+            <w:tcW w:type="dxa" w:w="1245"/>
+            <w:vAlign w:val="center"/>
+          </w:tcPr>
+          <w:p>
+            <w:r/>
+            <w:r>
+              <w:rPr>
+                <w:b w:val="0"/>
+                <w:sz w:val="18"/>
+              </w:rPr>
+              <w:t>Media</w:t>
+            </w:r>
+          </w:p>
+        </w:tc>
+        <w:tc>
+          <w:tcPr>
+            <w:tcW w:type="dxa" w:w="1710"/>
+            <w:vAlign w:val="center"/>
+          </w:tcPr>
+          <w:p>
+            <w:r/>
+            <w:r>
+              <w:rPr>
+                <w:b w:val="0"/>
+                <w:sz w:val="18"/>
+              </w:rPr>
+              <w:t>Por estimar</w:t>
+            </w:r>
+          </w:p>
+        </w:tc>
+        <w:tc>
+          <w:tcPr>
+            <w:tcW w:type="dxa" w:w="1710"/>
+            <w:vAlign w:val="center"/>
+          </w:tcPr>
+          <w:p>
+            <w:r/>
+            <w:r>
+              <w:rPr>
+                <w:b w:val="0"/>
+                <w:sz w:val="18"/>
+              </w:rPr>
+              <w:t>Objetivo</w:t>
+            </w:r>
+          </w:p>
+        </w:tc>
+      </w:tr>
+      <w:tr>
+        <w:trPr>
+          <w:cantSplit/>
+        </w:trPr>
+        <w:tc>
+          <w:tcPr>
+            <w:tcW w:type="dxa" w:w="2145"/>
+            <w:vAlign w:val="center"/>
+          </w:tcPr>
+          <w:p>
+            <w:r/>
+            <w:r>
+              <w:rPr>
+                <w:b w:val="0"/>
+                <w:sz w:val="18"/>
+              </w:rPr>
+              <w:t>HU-035</w:t>
+            </w:r>
+          </w:p>
+        </w:tc>
+        <w:tc>
+          <w:tcPr>
+            <w:tcW w:type="dxa" w:w="1425"/>
+            <w:vAlign w:val="center"/>
+          </w:tcPr>
+          <w:p>
+            <w:r/>
+            <w:r>
+              <w:rPr>
+                <w:b w:val="0"/>
+                <w:sz w:val="18"/>
+              </w:rPr>
+              <w:t>Web / Ofertas</w:t>
+            </w:r>
+          </w:p>
+        </w:tc>
+        <w:tc>
+          <w:tcPr>
+            <w:tcW w:type="dxa" w:w="2460"/>
+            <w:vAlign w:val="center"/>
+          </w:tcPr>
+          <w:p>
+            <w:r/>
+            <w:r>
+              <w:rPr>
+                <w:b w:val="0"/>
+                <w:sz w:val="18"/>
+              </w:rPr>
+              <w:t>Como usuario Web que recibe ofertas de reasignación, quiero una experiencia más clara y moderna, para comprender su estado y responder con menor fricción.</w:t>
+            </w:r>
+          </w:p>
+        </w:tc>
+        <w:tc>
+          <w:tcPr>
+            <w:tcW w:type="dxa" w:w="1245"/>
+            <w:vAlign w:val="center"/>
+          </w:tcPr>
+          <w:p>
+            <w:r/>
+            <w:r>
+              <w:rPr>
+                <w:b w:val="0"/>
+                <w:sz w:val="18"/>
+              </w:rPr>
+              <w:t>Media</w:t>
+            </w:r>
+          </w:p>
+        </w:tc>
+        <w:tc>
+          <w:tcPr>
+            <w:tcW w:type="dxa" w:w="1710"/>
+            <w:vAlign w:val="center"/>
+          </w:tcPr>
+          <w:p>
+            <w:r/>
+            <w:r>
+              <w:rPr>
+                <w:b w:val="0"/>
+                <w:sz w:val="18"/>
+              </w:rPr>
+              <w:t>Por estimar</w:t>
+            </w:r>
+          </w:p>
+        </w:tc>
+        <w:tc>
+          <w:tcPr>
+            <w:tcW w:type="dxa" w:w="1710"/>
+            <w:vAlign w:val="center"/>
+          </w:tcPr>
+          <w:p>
+            <w:r/>
+            <w:r>
+              <w:rPr>
+                <w:b w:val="0"/>
+                <w:sz w:val="18"/>
+              </w:rPr>
+              <w:t>Objetivo</w:t>
+            </w:r>
+          </w:p>
+        </w:tc>
+      </w:tr>
+      <w:tr>
+        <w:trPr>
+          <w:cantSplit/>
+        </w:trPr>
+        <w:tc>
+          <w:tcPr>
+            <w:tcW w:type="dxa" w:w="2145"/>
+            <w:vAlign w:val="center"/>
+          </w:tcPr>
+          <w:p>
+            <w:r/>
+            <w:r>
+              <w:rPr>
+                <w:b w:val="0"/>
+                <w:sz w:val="18"/>
+              </w:rPr>
+              <w:t>HU-036</w:t>
+            </w:r>
+          </w:p>
+        </w:tc>
+        <w:tc>
+          <w:tcPr>
+            <w:tcW w:type="dxa" w:w="1425"/>
+            <w:vAlign w:val="center"/>
+          </w:tcPr>
+          <w:p>
+            <w:r/>
+            <w:r>
+              <w:rPr>
+                <w:b w:val="0"/>
+                <w:sz w:val="18"/>
+              </w:rPr>
+              <w:t>Desktop institucional</w:t>
+            </w:r>
+          </w:p>
+        </w:tc>
+        <w:tc>
+          <w:tcPr>
+            <w:tcW w:type="dxa" w:w="2460"/>
+            <w:vAlign w:val="center"/>
+          </w:tcPr>
+          <w:p>
+            <w:r/>
+            <w:r>
+              <w:rPr>
+                <w:b w:val="0"/>
+                <w:sz w:val="18"/>
+              </w:rPr>
+              <w:t>Como funcionario autorizado, quiero consultar desde Desktop el detalle de un proceso de reasignación, para supervisar candidatos, ofertas, política y trazabilidad sin alterar el proceso.</w:t>
+            </w:r>
+          </w:p>
+        </w:tc>
+        <w:tc>
+          <w:tcPr>
+            <w:tcW w:type="dxa" w:w="1245"/>
+            <w:vAlign w:val="center"/>
+          </w:tcPr>
+          <w:p>
+            <w:r/>
+            <w:r>
+              <w:rPr>
+                <w:b w:val="0"/>
+                <w:sz w:val="18"/>
+              </w:rPr>
+              <w:t>Alta</w:t>
+            </w:r>
+          </w:p>
+        </w:tc>
+        <w:tc>
+          <w:tcPr>
+            <w:tcW w:type="dxa" w:w="1710"/>
+            <w:vAlign w:val="center"/>
+          </w:tcPr>
+          <w:p>
+            <w:r/>
+            <w:r>
+              <w:rPr>
+                <w:b w:val="0"/>
+                <w:sz w:val="18"/>
+              </w:rPr>
+              <w:t>Por estimar</w:t>
+            </w:r>
+          </w:p>
+        </w:tc>
+        <w:tc>
+          <w:tcPr>
+            <w:tcW w:type="dxa" w:w="1710"/>
+            <w:vAlign w:val="center"/>
+          </w:tcPr>
+          <w:p>
+            <w:r/>
+            <w:r>
+              <w:rPr>
+                <w:b w:val="0"/>
+                <w:sz w:val="18"/>
+              </w:rPr>
+              <w:t>Objetivo</w:t>
+            </w:r>
+          </w:p>
+        </w:tc>
+      </w:tr>
+      <w:tr>
+        <w:trPr>
+          <w:cantSplit/>
+        </w:trPr>
+        <w:tc>
+          <w:tcPr>
+            <w:tcW w:type="dxa" w:w="2145"/>
+            <w:vAlign w:val="center"/>
+          </w:tcPr>
+          <w:p>
+            <w:r/>
+            <w:r>
+              <w:rPr>
+                <w:b w:val="0"/>
+                <w:sz w:val="18"/>
+              </w:rPr>
+              <w:t>HU-037</w:t>
+            </w:r>
+          </w:p>
+        </w:tc>
+        <w:tc>
+          <w:tcPr>
+            <w:tcW w:type="dxa" w:w="1425"/>
+            <w:vAlign w:val="center"/>
+          </w:tcPr>
+          <w:p>
+            <w:r/>
+            <w:r>
+              <w:rPr>
+                <w:b w:val="0"/>
+                <w:sz w:val="18"/>
+              </w:rPr>
+              <w:t>Desktop institucional</w:t>
+            </w:r>
+          </w:p>
+        </w:tc>
+        <w:tc>
+          <w:tcPr>
+            <w:tcW w:type="dxa" w:w="2460"/>
+            <w:vAlign w:val="center"/>
+          </w:tcPr>
+          <w:p>
+            <w:r/>
+            <w:r>
+              <w:rPr>
+                <w:b w:val="0"/>
+                <w:sz w:val="18"/>
+              </w:rPr>
+              <w:t>Como usuario institucional autorizado, quiero consultar indicadores y reportes desde CitaJusta Desktop, para analizar citas, recuperación de cupos y ofertas dentro de mi ámbito.</w:t>
+            </w:r>
+          </w:p>
+        </w:tc>
+        <w:tc>
+          <w:tcPr>
+            <w:tcW w:type="dxa" w:w="1245"/>
+            <w:vAlign w:val="center"/>
+          </w:tcPr>
+          <w:p>
+            <w:r/>
+            <w:r>
+              <w:rPr>
+                <w:b w:val="0"/>
+                <w:sz w:val="18"/>
+              </w:rPr>
+              <w:t>Media</w:t>
+            </w:r>
+          </w:p>
+        </w:tc>
+        <w:tc>
+          <w:tcPr>
+            <w:tcW w:type="dxa" w:w="1710"/>
+            <w:vAlign w:val="center"/>
+          </w:tcPr>
+          <w:p>
+            <w:r/>
+            <w:r>
+              <w:rPr>
+                <w:b w:val="0"/>
+                <w:sz w:val="18"/>
+              </w:rPr>
+              <w:t>Por estimar</w:t>
+            </w:r>
+          </w:p>
+        </w:tc>
+        <w:tc>
+          <w:tcPr>
+            <w:tcW w:type="dxa" w:w="1710"/>
+            <w:vAlign w:val="center"/>
+          </w:tcPr>
+          <w:p>
+            <w:r/>
+            <w:r>
+              <w:rPr>
+                <w:b w:val="0"/>
+                <w:sz w:val="18"/>
+              </w:rPr>
+              <w:t>Objetivo</w:t>
+            </w:r>
+          </w:p>
+        </w:tc>
+      </w:tr>
+      <w:tr>
+        <w:trPr>
+          <w:cantSplit/>
+        </w:trPr>
+        <w:tc>
+          <w:tcPr>
+            <w:tcW w:type="dxa" w:w="2145"/>
+            <w:vAlign w:val="center"/>
+          </w:tcPr>
+          <w:p>
+            <w:r/>
+            <w:r>
+              <w:rPr>
+                <w:b w:val="0"/>
+                <w:sz w:val="18"/>
+              </w:rPr>
+              <w:t>HU-038</w:t>
+            </w:r>
+          </w:p>
+        </w:tc>
+        <w:tc>
+          <w:tcPr>
+            <w:tcW w:type="dxa" w:w="1425"/>
+            <w:vAlign w:val="center"/>
+          </w:tcPr>
+          <w:p>
+            <w:r/>
+            <w:r>
+              <w:rPr>
+                <w:b w:val="0"/>
+                <w:sz w:val="18"/>
+              </w:rPr>
+              <w:t>Desktop institucional / Auditoría</w:t>
+            </w:r>
+          </w:p>
+        </w:tc>
+        <w:tc>
+          <w:tcPr>
+            <w:tcW w:type="dxa" w:w="2460"/>
+            <w:vAlign w:val="center"/>
+          </w:tcPr>
+          <w:p>
+            <w:r/>
+            <w:r>
+              <w:rPr>
+                <w:b w:val="0"/>
+                <w:sz w:val="18"/>
+              </w:rPr>
+              <w:t>Como auditor autorizado, quiero consultar desde CitaJusta Desktop la bitácora de operaciones relevantes de mi ámbito institucional, para reconstruir qué ocurrió, cuándo, por quién o por el sistema y sobre qué recurso, sin alterar los eventos registrados.</w:t>
+            </w:r>
+          </w:p>
+        </w:tc>
+        <w:tc>
+          <w:tcPr>
+            <w:tcW w:type="dxa" w:w="1245"/>
+            <w:vAlign w:val="center"/>
+          </w:tcPr>
+          <w:p>
+            <w:r/>
+            <w:r>
+              <w:rPr>
+                <w:b w:val="0"/>
+                <w:sz w:val="18"/>
+              </w:rPr>
+              <w:t>Alta</w:t>
+            </w:r>
+          </w:p>
+        </w:tc>
+        <w:tc>
+          <w:tcPr>
+            <w:tcW w:type="dxa" w:w="1710"/>
+            <w:vAlign w:val="center"/>
+          </w:tcPr>
+          <w:p>
+            <w:r/>
+            <w:r>
+              <w:rPr>
+                <w:b w:val="0"/>
+                <w:sz w:val="18"/>
+              </w:rPr>
+              <w:t>Por estimar</w:t>
+            </w:r>
+          </w:p>
+        </w:tc>
+        <w:tc>
+          <w:tcPr>
+            <w:tcW w:type="dxa" w:w="1710"/>
+            <w:vAlign w:val="center"/>
+          </w:tcPr>
+          <w:p>
+            <w:r/>
+            <w:r>
+              <w:rPr>
+                <w:b w:val="0"/>
+                <w:sz w:val="18"/>
+              </w:rPr>
+              <w:t>Objetivo</w:t>
+            </w:r>
+          </w:p>
+        </w:tc>
+      </w:tr>
+      <w:tr>
+        <w:trPr>
+          <w:cantSplit/>
+        </w:trPr>
+        <w:tc>
+          <w:tcPr>
+            <w:tcW w:type="dxa" w:w="2145"/>
+            <w:vAlign w:val="center"/>
+          </w:tcPr>
+          <w:p>
+            <w:r/>
+            <w:r>
+              <w:rPr>
+                <w:b w:val="0"/>
+                <w:sz w:val="18"/>
+              </w:rPr>
+              <w:t>HU-039</w:t>
+            </w:r>
+          </w:p>
+        </w:tc>
+        <w:tc>
+          <w:tcPr>
+            <w:tcW w:type="dxa" w:w="1425"/>
+            <w:vAlign w:val="center"/>
+          </w:tcPr>
+          <w:p>
+            <w:r/>
+            <w:r>
+              <w:rPr>
+                <w:b w:val="0"/>
+                <w:sz w:val="18"/>
+              </w:rPr>
+              <w:t>Integraciones externas</w:t>
+            </w:r>
+          </w:p>
+        </w:tc>
+        <w:tc>
+          <w:tcPr>
+            <w:tcW w:type="dxa" w:w="2460"/>
+            <w:vAlign w:val="center"/>
+          </w:tcPr>
+          <w:p>
+            <w:r/>
+            <w:r>
+              <w:rPr>
+                <w:b w:val="0"/>
+                <w:sz w:val="18"/>
+              </w:rPr>
+              <w:t>Como usuario de CitaJusta, quiero recibir correos transaccionales sobre eventos relevantes de mis citas y reasignaciones, para mantenerme informado también fuera de la aplicación.</w:t>
+            </w:r>
+          </w:p>
+        </w:tc>
+        <w:tc>
+          <w:tcPr>
+            <w:tcW w:type="dxa" w:w="1245"/>
+            <w:vAlign w:val="center"/>
+          </w:tcPr>
+          <w:p>
+            <w:r/>
+            <w:r>
+              <w:rPr>
+                <w:b w:val="0"/>
+                <w:sz w:val="18"/>
+              </w:rPr>
+              <w:t>Alta</w:t>
+            </w:r>
+          </w:p>
+        </w:tc>
+        <w:tc>
+          <w:tcPr>
+            <w:tcW w:type="dxa" w:w="1710"/>
+            <w:vAlign w:val="center"/>
+          </w:tcPr>
+          <w:p>
+            <w:r/>
+            <w:r>
+              <w:rPr>
+                <w:b w:val="0"/>
+                <w:sz w:val="18"/>
+              </w:rPr>
+              <w:t>Por estimar</w:t>
+            </w:r>
+          </w:p>
+        </w:tc>
+        <w:tc>
+          <w:tcPr>
+            <w:tcW w:type="dxa" w:w="1710"/>
+            <w:vAlign w:val="center"/>
+          </w:tcPr>
+          <w:p>
+            <w:r/>
+            <w:r>
+              <w:rPr>
+                <w:b w:val="0"/>
+                <w:sz w:val="18"/>
+              </w:rPr>
+              <w:t>Objetivo</w:t>
+            </w:r>
+          </w:p>
+        </w:tc>
+      </w:tr>
+      <w:tr>
+        <w:trPr>
+          <w:cantSplit/>
+        </w:trPr>
+        <w:tc>
+          <w:tcPr>
+            <w:tcW w:type="dxa" w:w="2145"/>
+            <w:vAlign w:val="center"/>
+          </w:tcPr>
+          <w:p>
+            <w:r/>
+            <w:r>
+              <w:rPr>
+                <w:b w:val="0"/>
+                <w:sz w:val="18"/>
+              </w:rPr>
+              <w:t>HU-040</w:t>
+            </w:r>
+          </w:p>
+        </w:tc>
+        <w:tc>
+          <w:tcPr>
+            <w:tcW w:type="dxa" w:w="1425"/>
+            <w:vAlign w:val="center"/>
+          </w:tcPr>
+          <w:p>
+            <w:r/>
+            <w:r>
+              <w:rPr>
+                <w:b w:val="0"/>
+                <w:sz w:val="18"/>
+              </w:rPr>
+              <w:t>Integraciones externas</w:t>
+            </w:r>
+          </w:p>
+        </w:tc>
+        <w:tc>
+          <w:tcPr>
+            <w:tcW w:type="dxa" w:w="2460"/>
+            <w:vAlign w:val="center"/>
+          </w:tcPr>
+          <w:p>
+            <w:r/>
+            <w:r>
+              <w:rPr>
+                <w:b w:val="0"/>
+                <w:sz w:val="18"/>
+              </w:rPr>
+              <w:t>Como usuario, quiero iniciar sesión con mi cuenta Google, para acceder a CitaJusta mediante un método adicional de autenticación.</w:t>
+            </w:r>
+          </w:p>
+        </w:tc>
+        <w:tc>
+          <w:tcPr>
+            <w:tcW w:type="dxa" w:w="1245"/>
+            <w:vAlign w:val="center"/>
+          </w:tcPr>
+          <w:p>
+            <w:r/>
+            <w:r>
+              <w:rPr>
+                <w:b w:val="0"/>
+                <w:sz w:val="18"/>
+              </w:rPr>
+              <w:t>Alta</w:t>
+            </w:r>
+          </w:p>
+        </w:tc>
+        <w:tc>
+          <w:tcPr>
+            <w:tcW w:type="dxa" w:w="1710"/>
+            <w:vAlign w:val="center"/>
+          </w:tcPr>
+          <w:p>
+            <w:r/>
+            <w:r>
+              <w:rPr>
+                <w:b w:val="0"/>
+                <w:sz w:val="18"/>
+              </w:rPr>
+              <w:t>Por estimar</w:t>
+            </w:r>
+          </w:p>
+        </w:tc>
+        <w:tc>
+          <w:tcPr>
+            <w:tcW w:type="dxa" w:w="1710"/>
+            <w:vAlign w:val="center"/>
+          </w:tcPr>
+          <w:p>
+            <w:r/>
+            <w:r>
+              <w:rPr>
+                <w:b w:val="0"/>
+                <w:sz w:val="18"/>
+              </w:rPr>
+              <w:t>Objetivo</w:t>
+            </w:r>
+          </w:p>
+        </w:tc>
+      </w:tr>
+      <w:tr>
+        <w:trPr>
+          <w:cantSplit/>
+        </w:trPr>
+        <w:tc>
+          <w:tcPr>
+            <w:tcW w:type="dxa" w:w="2145"/>
+            <w:vAlign w:val="center"/>
+          </w:tcPr>
+          <w:p>
+            <w:r/>
+            <w:r>
+              <w:rPr>
+                <w:b w:val="0"/>
+                <w:sz w:val="18"/>
+              </w:rPr>
+              <w:t>HU-041</w:t>
+            </w:r>
+          </w:p>
+        </w:tc>
+        <w:tc>
+          <w:tcPr>
+            <w:tcW w:type="dxa" w:w="1425"/>
+            <w:vAlign w:val="center"/>
+          </w:tcPr>
+          <w:p>
+            <w:r/>
+            <w:r>
+              <w:rPr>
+                <w:b w:val="0"/>
+                <w:sz w:val="18"/>
+              </w:rPr>
+              <w:t>Integraciones externas</w:t>
+            </w:r>
+          </w:p>
+        </w:tc>
+        <w:tc>
+          <w:tcPr>
+            <w:tcW w:type="dxa" w:w="2460"/>
+            <w:vAlign w:val="center"/>
+          </w:tcPr>
+          <w:p>
+            <w:r/>
+            <w:r>
+              <w:rPr>
+                <w:b w:val="0"/>
+                <w:sz w:val="18"/>
+              </w:rPr>
+              <w:t>Como usuario con una cita confirmada, quiero agregarla a Google Calendar, para verla junto a mis compromisos personales.</w:t>
+            </w:r>
+          </w:p>
+        </w:tc>
+        <w:tc>
+          <w:tcPr>
+            <w:tcW w:type="dxa" w:w="1245"/>
+            <w:vAlign w:val="center"/>
+          </w:tcPr>
+          <w:p>
+            <w:r/>
+            <w:r>
+              <w:rPr>
+                <w:b w:val="0"/>
+                <w:sz w:val="18"/>
+              </w:rPr>
+              <w:t>Media</w:t>
+            </w:r>
+          </w:p>
+        </w:tc>
+        <w:tc>
+          <w:tcPr>
+            <w:tcW w:type="dxa" w:w="1710"/>
+            <w:vAlign w:val="center"/>
+          </w:tcPr>
+          <w:p>
+            <w:r/>
+            <w:r>
+              <w:rPr>
+                <w:b w:val="0"/>
+                <w:sz w:val="18"/>
+              </w:rPr>
+              <w:t>Por estimar</w:t>
+            </w:r>
+          </w:p>
+        </w:tc>
+        <w:tc>
+          <w:tcPr>
+            <w:tcW w:type="dxa" w:w="1710"/>
+            <w:vAlign w:val="center"/>
+          </w:tcPr>
+          <w:p>
+            <w:r/>
+            <w:r>
+              <w:rPr>
+                <w:b w:val="0"/>
+                <w:sz w:val="18"/>
+              </w:rPr>
+              <w:t>Objetivo</w:t>
+            </w:r>
+          </w:p>
+        </w:tc>
+      </w:tr>
+      <w:tr>
+        <w:trPr>
+          <w:cantSplit/>
+        </w:trPr>
+        <w:tc>
+          <w:tcPr>
+            <w:tcW w:type="dxa" w:w="2145"/>
+            <w:vAlign w:val="center"/>
+          </w:tcPr>
+          <w:p>
+            <w:r/>
+            <w:r>
+              <w:rPr>
+                <w:b w:val="0"/>
+                <w:sz w:val="18"/>
+              </w:rPr>
+              <w:t>HU-042</w:t>
+            </w:r>
+          </w:p>
+        </w:tc>
+        <w:tc>
+          <w:tcPr>
+            <w:tcW w:type="dxa" w:w="1425"/>
+            <w:vAlign w:val="center"/>
+          </w:tcPr>
+          <w:p>
+            <w:r/>
+            <w:r>
+              <w:rPr>
+                <w:b w:val="0"/>
+                <w:sz w:val="18"/>
+              </w:rPr>
+              <w:t>Integraciones externas</w:t>
+            </w:r>
+          </w:p>
+        </w:tc>
+        <w:tc>
+          <w:tcPr>
+            <w:tcW w:type="dxa" w:w="2460"/>
+            <w:vAlign w:val="center"/>
+          </w:tcPr>
+          <w:p>
+            <w:r/>
+            <w:r>
+              <w:rPr>
+                <w:b w:val="0"/>
+                <w:sz w:val="18"/>
+              </w:rPr>
+              <w:t>Como usuario, quiero visualizar la ubicación de la sede y acceder a una ruta en Google Maps, para facilitar mi llegada a la atención.</w:t>
+            </w:r>
+          </w:p>
+        </w:tc>
+        <w:tc>
+          <w:tcPr>
+            <w:tcW w:type="dxa" w:w="1245"/>
+            <w:vAlign w:val="center"/>
+          </w:tcPr>
+          <w:p>
+            <w:r/>
+            <w:r>
+              <w:rPr>
+                <w:b w:val="0"/>
+                <w:sz w:val="18"/>
+              </w:rPr>
+              <w:t>Media</w:t>
+            </w:r>
+          </w:p>
+        </w:tc>
+        <w:tc>
+          <w:tcPr>
+            <w:tcW w:type="dxa" w:w="1710"/>
+            <w:vAlign w:val="center"/>
+          </w:tcPr>
+          <w:p>
+            <w:r/>
+            <w:r>
+              <w:rPr>
+                <w:b w:val="0"/>
+                <w:sz w:val="18"/>
+              </w:rPr>
+              <w:t>Por estimar</w:t>
+            </w:r>
+          </w:p>
+        </w:tc>
+        <w:tc>
+          <w:tcPr>
+            <w:tcW w:type="dxa" w:w="1710"/>
+            <w:vAlign w:val="center"/>
+          </w:tcPr>
+          <w:p>
+            <w:r/>
+            <w:r>
+              <w:rPr>
+                <w:b w:val="0"/>
+                <w:sz w:val="18"/>
+              </w:rPr>
+              <w:t>Objetivo</w:t>
+            </w:r>
+          </w:p>
+        </w:tc>
+      </w:tr>
+      <w:tr>
+        <w:trPr>
+          <w:cantSplit/>
+        </w:trPr>
+        <w:tc>
+          <w:tcPr>
+            <w:tcW w:type="dxa" w:w="2145"/>
+            <w:vAlign w:val="center"/>
+          </w:tcPr>
+          <w:p>
+            <w:r/>
+            <w:r>
+              <w:rPr>
+                <w:b w:val="0"/>
+                <w:sz w:val="18"/>
+              </w:rPr>
+              <w:t>HU-043</w:t>
+            </w:r>
+          </w:p>
+        </w:tc>
+        <w:tc>
+          <w:tcPr>
+            <w:tcW w:type="dxa" w:w="1425"/>
+            <w:vAlign w:val="center"/>
+          </w:tcPr>
+          <w:p>
+            <w:r/>
+            <w:r>
+              <w:rPr>
+                <w:b w:val="0"/>
+                <w:sz w:val="18"/>
+              </w:rPr>
+              <w:t>Integraciones externas</w:t>
+            </w:r>
+          </w:p>
+        </w:tc>
+        <w:tc>
+          <w:tcPr>
+            <w:tcW w:type="dxa" w:w="2460"/>
+            <w:vAlign w:val="center"/>
+          </w:tcPr>
+          <w:p>
+            <w:r/>
+            <w:r>
+              <w:rPr>
+                <w:b w:val="0"/>
+                <w:sz w:val="18"/>
+              </w:rPr>
+              <w:t>Como usuario que haya otorgado consentimiento, quiero recibir avisos seleccionados por WhatsApp, para enterarme oportunamente de eventos de atención.</w:t>
+            </w:r>
+          </w:p>
+        </w:tc>
+        <w:tc>
+          <w:tcPr>
+            <w:tcW w:type="dxa" w:w="1245"/>
+            <w:vAlign w:val="center"/>
+          </w:tcPr>
+          <w:p>
+            <w:r/>
+            <w:r>
+              <w:rPr>
+                <w:b w:val="0"/>
+                <w:sz w:val="18"/>
+              </w:rPr>
+              <w:t>Media</w:t>
+            </w:r>
+          </w:p>
+        </w:tc>
+        <w:tc>
+          <w:tcPr>
+            <w:tcW w:type="dxa" w:w="1710"/>
+            <w:vAlign w:val="center"/>
+          </w:tcPr>
+          <w:p>
+            <w:r/>
+            <w:r>
+              <w:rPr>
+                <w:b w:val="0"/>
+                <w:sz w:val="18"/>
+              </w:rPr>
+              <w:t>Por estimar</w:t>
+            </w:r>
+          </w:p>
+        </w:tc>
+        <w:tc>
+          <w:tcPr>
+            <w:tcW w:type="dxa" w:w="1710"/>
+            <w:vAlign w:val="center"/>
+          </w:tcPr>
+          <w:p>
+            <w:r/>
+            <w:r>
+              <w:rPr>
+                <w:b w:val="0"/>
+                <w:sz w:val="18"/>
+              </w:rPr>
               <w:t>Objetivo</w:t>
             </w:r>
           </w:p>
@@ -10279,28 +11624,18 @@
       <w:bookmarkStart w:id="4" w:name="_heading=h.n6ke7rp177fv" w:colFirst="0" w:colLast="0"/>
       <w:bookmarkEnd w:id="4"/>
       <w:r>
-        <w:t xml:space="preserve">5. </w:t>
+        <w:t>5. Observaciones de actualización al 04-10-2026</w:t>
       </w:r>
       <w:proofErr w:type="spellStart"/>
-      <w:r>
-        <w:t>Observaciones</w:t>
-      </w:r>
+      <w:r/>
       <w:proofErr w:type="spellEnd"/>
-      <w:r>
-        <w:t xml:space="preserve"> para la </w:t>
-      </w:r>
+      <w:r/>
       <w:proofErr w:type="spellStart"/>
-      <w:r>
-        <w:t>primera</w:t>
-      </w:r>
+      <w:r/>
       <w:proofErr w:type="spellEnd"/>
-      <w:r>
-        <w:t xml:space="preserve"> </w:t>
-      </w:r>
+      <w:r/>
       <w:proofErr w:type="spellStart"/>
-      <w:r>
-        <w:t>evaluación</w:t>
-      </w:r>
+      <w:r/>
       <w:proofErr w:type="spellEnd"/>
     </w:p>
     <w:p>
@@ -10318,7 +11653,7 @@
         </w:pBdr>
       </w:pPr>
       <w:r>
-        <w:t>Los Story Points de HU-001 a HU-020 corresponden a estimaciones documentadas previamente. HU-021 a HU-029 se incorporan sin asignar Story Points hasta que el Scrum Team realice su refinamiento.</w:t>
+        <w:t>Los Story Points de HU-001 a HU-020 corresponden a estimaciones documentadas previamente. HU-021 a HU-043 se mantienen sin Story Points asignados hasta que el Scrum Team realice su refinamiento/Planning formal.</w:t>
       </w:r>
       <w:proofErr w:type="spellStart"/>
       <w:r/>
@@ -10384,7 +11719,7 @@
         </w:pBdr>
       </w:pPr>
       <w:r>
-        <w:t>El backend de HU-001 a HU-020 se encuentra implementado. HU-021 a HU-026 cerraron la experiencia Web del MVP. Sprint 7 ya inició Desktop/Tauri: HU-027 creó la fundación nativa (PR #112, merge 6adab82), HU-028 incorporó autenticación real y @citajusta/client-core (PR #113, merge ae151b3), y HU-029 entregó gestión institucional de sedes y servicios (commit f58c742, merge e1cdb2e). Con ello, HU-001 a HU-029 están Done y el siguiente PBI Desktop queda pendiente de refinamiento.</w:t>
+        <w:t>HU-001 a HU-038 están implementadas y cerradas. Sprint 7 completó la aplicación institucional Desktop y HU-035 modernizó la experiencia Web de ofertas. Sprint 8 planifica HU-039 a HU-043: Resend, Google OAuth/OpenID Connect, Google Calendar, Google Maps y WhatsApp condicionado a proveedor, consentimiento, plantillas, costos y viabilidad. Sprint 9 se reserva para Docker/Docker Compose, OpenAPI, hardening, documentación y evidencias finales.</w:t>
       </w:r>
       <w:proofErr w:type="spellStart"/>
       <w:r/>
@@ -10539,7 +11874,7 @@
         <w:spacing w:after="200"/>
       </w:pPr>
       <w:r>
-        <w:t>Las evidencias de GitHub, Pull Requests y pruebas deben asociarse progresivamente a cada historia. El estado Done debe reflejar cumplimiento verificable del alcance declarado, no sólo una implementación parcial. Para HU-027 a HU-029 se consideran build/cargo, regresiones Web/API/Desktop y validación manual Tauri cuando corresponde.</w:t>
+        <w:t>El estado Done exige alcance verificable. HU-039 a HU-043 permanecen Pendientes hasta su implementación y validación; documentarlas no implica cumplimiento técnico. Las evidencias de GitHub, Pull Requests y pruebas deben asociarse progresivamente a cada historia.</w:t>
       </w:r>
       <w:proofErr w:type="spellStart"/>
       <w:r/>

</xml_diff>